<commit_message>
Fix 2IP signature block: replace individual IP name lines (para 24, 27)
Source documents have IP1 name at para 24 and IP2 name at para 27,
stored in w:ins tracked-change elements (invisible to .text but rendered
by Word). Add those to prep replacements so output shows IP1NAME/IP2NAME
instead of original case names.

Also extend PII scan to use .//<w:t> XPath to catch w:ins content.
</commit_message>
<xml_diff>
--- a/poa_template_2ip_2agent.docx
+++ b/poa_template_2ip_2agent.docx
@@ -790,29 +790,12 @@
           <w:rFonts w:eastAsia="Times New Roman"/>
         </w:rPr>
       </w:pPr>
-      <w:del w:id="134" w:author="Jessie Li" w:date="2026-02-23T12:14:00Z" w16du:dateUtc="2026-02-23T20:14:00Z">
-        <w:r>
-          <w:rPr>
-            <w:rFonts w:eastAsiaTheme="minorEastAsia"/>
-            <w:lang w:eastAsia="zh-CN"/>
-          </w:rPr>
-          <w:delText>QIAN DENG</w:delText>
-        </w:r>
-      </w:del>
-      <w:ins w:id="135" w:author="Jessie Li" w:date="2026-02-23T12:14:00Z" w16du:dateUtc="2026-02-23T20:14:00Z">
-        <w:r>
-          <w:rPr>
-            <w:rFonts w:eastAsiaTheme="minorEastAsia"/>
-            <w:lang w:eastAsia="zh-CN"/>
-          </w:rPr>
-          <w:t>XINMIAO JIA</w:t>
-        </w:r>
-      </w:ins>
-      <w:r>
-        <w:rPr>
-          <w:rFonts w:eastAsia="Times New Roman"/>
-        </w:rPr>
-        <w:t xml:space="preserve"> </w:t>
+      <w:r>
+        <w:rPr>
+          <w:rFonts w:eastAsiaTheme="minorEastAsia"/>
+          <w:lang w:eastAsia="zh-CN"/>
+        </w:rPr>
+        <w:t xml:space="preserve">IP1NAME</w:t>
       </w:r>
     </w:p>
     <w:p>
@@ -958,35 +941,12 @@
           <w:lang w:eastAsia="zh-CN"/>
         </w:rPr>
       </w:pPr>
-      <w:del w:id="136" w:author="Jessie Li" w:date="2026-02-23T12:15:00Z" w16du:dateUtc="2026-02-23T20:15:00Z">
-        <w:r>
-          <w:rPr>
-            <w:rFonts w:eastAsiaTheme="minorEastAsia"/>
-            <w:lang w:eastAsia="zh-CN"/>
-          </w:rPr>
-          <w:delText>JUNJIE GUO</w:delText>
-        </w:r>
-      </w:del>
-      <w:ins w:id="137" w:author="Jessie Li" w:date="2026-02-23T12:15:00Z" w16du:dateUtc="2026-02-23T20:15:00Z">
-        <w:r>
-          <w:rPr>
-            <w:rFonts w:eastAsiaTheme="minorEastAsia"/>
-            <w:lang w:eastAsia="zh-CN"/>
-          </w:rPr>
-          <w:t>ZHEN WANG</w:t>
-        </w:r>
-      </w:ins>
-      <w:r>
-        <w:rPr>
-          <w:rFonts w:eastAsia="Times New Roman"/>
-        </w:rPr>
-        <w:t> </w:t>
-      </w:r>
-      <w:r>
-        <w:rPr>
+      <w:r>
+        <w:rPr>
+          <w:rFonts w:eastAsiaTheme="minorEastAsia"/>
           <w:lang w:eastAsia="zh-CN"/>
         </w:rPr>
-        <w:br w:type="page"/>
+        <w:t xml:space="preserve">IP2NAME</w:t>
       </w:r>
     </w:p>
     <w:p>

</xml_diff>